<commit_message>
Cache Fix for Precipitation, docx, and ppt gen
</commit_message>
<xml_diff>
--- a/tech_brief.docx
+++ b/tech_brief.docx
@@ -2,73 +2,27 @@
 <file path=word/document.xml><?xml version="1.0" encoding="utf-8"?>
 <w:document xmlns:wpc="http://schemas.microsoft.com/office/word/2010/wordprocessingCanvas" xmlns:mo="http://schemas.microsoft.com/office/mac/office/2008/main" xmlns:mc="http://schemas.openxmlformats.org/markup-compatibility/2006" xmlns:mv="urn:schemas-microsoft-com:mac:vml" xmlns:o="urn:schemas-microsoft-com:office:office" xmlns:r="http://schemas.openxmlformats.org/officeDocument/2006/relationships" xmlns:m="http://schemas.openxmlformats.org/officeDocument/2006/math" xmlns:v="urn:schemas-microsoft-com:vml" xmlns:wp14="http://schemas.microsoft.com/office/word/2010/wordprocessingDrawing" xmlns:wp="http://schemas.openxmlformats.org/drawingml/2006/wordprocessingDrawing" xmlns:w10="urn:schemas-microsoft-com:office:word" xmlns:w="http://schemas.openxmlformats.org/wordprocessingml/2006/main" xmlns:w14="http://schemas.microsoft.com/office/word/2010/wordml" xmlns:wpg="http://schemas.microsoft.com/office/word/2010/wordprocessingGroup" xmlns:wpi="http://schemas.microsoft.com/office/word/2010/wordprocessingInk" xmlns:wne="http://schemas.microsoft.com/office/word/2006/wordml" xmlns:wps="http://schemas.microsoft.com/office/word/2010/wordprocessingShape" mc:Ignorable="w14 wp14">
   <w:body>
-    <w:p>
-      <w:pPr>
-        <w:spacing w:after="40"/>
-        <w:jc w:val="center"/>
-      </w:pPr>
-      <w:r>
-        <w:rPr>
-          <w:b/>
-          <w:color w:val="9CA3AF"/>
-          <w:sz w:val="18"/>
-        </w:rPr>
-        <w:t>TECHNICAL BRIEF</w:t>
-      </w:r>
-    </w:p>
-    <w:p>
-      <w:pPr>
-        <w:spacing w:before="0" w:after="40"/>
-        <w:jc w:val="center"/>
-      </w:pPr>
-      <w:r>
-        <w:rPr>
-          <w:b/>
-          <w:color w:val="1F3864"/>
-          <w:sz w:val="30"/>
-        </w:rPr>
-        <w:t>Evaluating the Performance of Gated Recurrent Units</w:t>
-        <w:br/>
-        <w:t>for Multi-Parameter Weather Forecasting</w:t>
-      </w:r>
-    </w:p>
-    <w:p>
-      <w:pPr>
-        <w:spacing w:after="120"/>
-        <w:jc w:val="center"/>
-      </w:pPr>
-      <w:r>
-        <w:rPr>
-          <w:color w:val="555555"/>
-          <w:sz w:val="18"/>
-        </w:rPr>
-        <w:t>University of the Cordilleras  ·  College of CITCS  ·  B.S. Computer Science</w:t>
-        <w:br/>
-        <w:t>Castro, E. M.  ·  Millan, D. J. S.  ·  Mondoñedo, J. E.</w:t>
-      </w:r>
-    </w:p>
-    <w:p>
-      <w:pPr>
-        <w:spacing w:before="40" w:after="40"/>
-        <w:pBdr>
-          <w:bottom w:val="single" w:sz="6" w:space="1" w:color="2c3e50"/>
-        </w:pBdr>
-      </w:pPr>
-    </w:p>
     <w:tbl>
       <w:tblPr>
         <w:tblW w:type="auto" w:w="0"/>
-        <w:jc w:val="center"/>
         <w:tblLook w:firstColumn="1" w:firstRow="1" w:lastColumn="0" w:lastRow="0" w:noHBand="0" w:noVBand="1" w:val="04A0"/>
+        <w:tblBorders>
+          <w:top w:val="none"/>
+          <w:left w:val="none"/>
+          <w:bottom w:val="none"/>
+          <w:right w:val="none"/>
+          <w:insideH w:val="none"/>
+          <w:insideV w:val="none"/>
+        </w:tblBorders>
       </w:tblPr>
       <w:tblGrid>
-        <w:gridCol w:w="4989"/>
-        <w:gridCol w:w="4422"/>
+        <w:gridCol w:w="10540"/>
       </w:tblGrid>
       <w:tr>
         <w:tc>
           <w:tcPr>
-            <w:tcW w:type="dxa" w:w="4873"/>
+            <w:tcW w:type="dxa" w:w="10540"/>
+            <w:shd w:val="clear" w:color="auto" w:fill="1f3864"/>
             <w:tcBorders>
               <w:top w:val="none"/>
               <w:left w:val="none"/>
@@ -77,6 +31,745 @@
               <w:insideH w:val="none"/>
               <w:insideV w:val="none"/>
             </w:tcBorders>
+            <w:tcMar>
+              <w:top w:w="90" w:type="dxa"/>
+              <w:bottom w:w="90" w:type="dxa"/>
+              <w:left w:w="220" w:type="dxa"/>
+              <w:right w:w="220" w:type="dxa"/>
+            </w:tcMar>
+          </w:tcPr>
+          <w:p>
+            <w:pPr>
+              <w:spacing w:before="0" w:after="60"/>
+              <w:jc w:val="center"/>
+            </w:pPr>
+            <w:r>
+              <w:rPr>
+                <w:b/>
+                <w:color w:val="ADB5BD"/>
+                <w:sz w:val="14"/>
+              </w:rPr>
+              <w:t>■  TECHNICAL BRIEF  ■</w:t>
+            </w:r>
+          </w:p>
+          <w:p>
+            <w:pPr>
+              <w:spacing w:before="0" w:after="60"/>
+              <w:jc w:val="center"/>
+            </w:pPr>
+            <w:r>
+              <w:rPr>
+                <w:b/>
+                <w:color w:val="FFFFFF"/>
+                <w:sz w:val="28"/>
+              </w:rPr>
+              <w:t>Evaluating the Performance of Gated Recurrent Units</w:t>
+              <w:br/>
+              <w:t>for Multi-Parameter Weather Forecasting</w:t>
+            </w:r>
+          </w:p>
+          <w:p>
+            <w:pPr>
+              <w:spacing w:before="0" w:after="0"/>
+              <w:jc w:val="center"/>
+            </w:pPr>
+            <w:r>
+              <w:rPr>
+                <w:color w:val="ADC8E0"/>
+                <w:sz w:val="16"/>
+              </w:rPr>
+              <w:t>University of the Cordilleras  ·  College of CITCS  ·  B.S. Computer Science  ·  Castro, E. M.  ·  Millan, D. J. S.  ·  Mondoñedo, J. E.</w:t>
+            </w:r>
+          </w:p>
+        </w:tc>
+      </w:tr>
+    </w:tbl>
+    <w:p>
+      <w:pPr>
+        <w:spacing w:before="0" w:after="0"/>
+        <w:rPr>
+          <w:sz w:val="2"/>
+          <w:szCs w:val="2"/>
+        </w:rPr>
+      </w:pPr>
+    </w:p>
+    <w:tbl>
+      <w:tblPr>
+        <w:tblW w:type="auto" w:w="0"/>
+        <w:tblLook w:firstColumn="1" w:firstRow="1" w:lastColumn="0" w:lastRow="0" w:noHBand="0" w:noVBand="1" w:val="04A0"/>
+        <w:tblBorders>
+          <w:top w:val="none"/>
+          <w:left w:val="none"/>
+          <w:bottom w:val="none"/>
+          <w:right w:val="none"/>
+          <w:insideH w:val="none"/>
+          <w:insideV w:val="none"/>
+        </w:tblBorders>
+      </w:tblPr>
+      <w:tblGrid>
+        <w:gridCol w:w="2635"/>
+        <w:gridCol w:w="2635"/>
+        <w:gridCol w:w="2635"/>
+        <w:gridCol w:w="2635"/>
+      </w:tblGrid>
+      <w:tr>
+        <w:tc>
+          <w:tcPr>
+            <w:tcW w:type="dxa" w:w="2635"/>
+            <w:shd w:val="clear" w:color="auto" w:fill="2471a3"/>
+            <w:tcBorders>
+              <w:top w:val="none"/>
+              <w:left w:val="none"/>
+              <w:bottom w:val="none"/>
+              <w:right w:val="none"/>
+              <w:insideH w:val="none"/>
+              <w:insideV w:val="none"/>
+            </w:tcBorders>
+            <w:tcMar>
+              <w:top w:w="70" w:type="dxa"/>
+              <w:bottom w:w="70" w:type="dxa"/>
+              <w:left w:w="60" w:type="dxa"/>
+              <w:right w:w="60" w:type="dxa"/>
+            </w:tcMar>
+          </w:tcPr>
+          <w:p>
+            <w:pPr>
+              <w:spacing w:before="0" w:after="20"/>
+              <w:jc w:val="center"/>
+            </w:pPr>
+            <w:r>
+              <w:rPr>
+                <w:b/>
+                <w:color w:val="FFFFFF"/>
+                <w:sz w:val="38"/>
+              </w:rPr>
+              <w:t>5</w:t>
+            </w:r>
+          </w:p>
+          <w:p>
+            <w:pPr>
+              <w:spacing w:before="0" w:after="0"/>
+              <w:jc w:val="center"/>
+            </w:pPr>
+            <w:r>
+              <w:rPr>
+                <w:b/>
+                <w:color w:val="D6EAF8"/>
+                <w:sz w:val="13"/>
+              </w:rPr>
+              <w:t>MODELS</w:t>
+              <w:br/>
+              <w:t>EVALUATED</w:t>
+            </w:r>
+          </w:p>
+        </w:tc>
+        <w:tc>
+          <w:tcPr>
+            <w:tcW w:type="dxa" w:w="2635"/>
+            <w:shd w:val="clear" w:color="auto" w:fill="1a7a4a"/>
+            <w:tcBorders>
+              <w:top w:val="none"/>
+              <w:left w:val="none"/>
+              <w:bottom w:val="none"/>
+              <w:right w:val="none"/>
+              <w:insideH w:val="none"/>
+              <w:insideV w:val="none"/>
+            </w:tcBorders>
+            <w:tcMar>
+              <w:top w:w="70" w:type="dxa"/>
+              <w:bottom w:w="70" w:type="dxa"/>
+              <w:left w:w="60" w:type="dxa"/>
+              <w:right w:w="60" w:type="dxa"/>
+            </w:tcMar>
+          </w:tcPr>
+          <w:p>
+            <w:pPr>
+              <w:spacing w:before="0" w:after="20"/>
+              <w:jc w:val="center"/>
+            </w:pPr>
+            <w:r>
+              <w:rPr>
+                <w:b/>
+                <w:color w:val="FFFFFF"/>
+                <w:sz w:val="38"/>
+              </w:rPr>
+              <w:t>4</w:t>
+            </w:r>
+          </w:p>
+          <w:p>
+            <w:pPr>
+              <w:spacing w:before="0" w:after="0"/>
+              <w:jc w:val="center"/>
+            </w:pPr>
+            <w:r>
+              <w:rPr>
+                <w:b/>
+                <w:color w:val="D6EAF8"/>
+                <w:sz w:val="13"/>
+              </w:rPr>
+              <w:t>WEATHER</w:t>
+              <w:br/>
+              <w:t>VARIABLES</w:t>
+            </w:r>
+          </w:p>
+        </w:tc>
+        <w:tc>
+          <w:tcPr>
+            <w:tcW w:type="dxa" w:w="2635"/>
+            <w:shd w:val="clear" w:color="auto" w:fill="7d3c98"/>
+            <w:tcBorders>
+              <w:top w:val="none"/>
+              <w:left w:val="none"/>
+              <w:bottom w:val="none"/>
+              <w:right w:val="none"/>
+              <w:insideH w:val="none"/>
+              <w:insideV w:val="none"/>
+            </w:tcBorders>
+            <w:tcMar>
+              <w:top w:w="70" w:type="dxa"/>
+              <w:bottom w:w="70" w:type="dxa"/>
+              <w:left w:w="60" w:type="dxa"/>
+              <w:right w:w="60" w:type="dxa"/>
+            </w:tcMar>
+          </w:tcPr>
+          <w:p>
+            <w:pPr>
+              <w:spacing w:before="0" w:after="20"/>
+              <w:jc w:val="center"/>
+            </w:pPr>
+            <w:r>
+              <w:rPr>
+                <w:b/>
+                <w:color w:val="FFFFFF"/>
+                <w:sz w:val="38"/>
+              </w:rPr>
+              <w:t>2</w:t>
+            </w:r>
+          </w:p>
+          <w:p>
+            <w:pPr>
+              <w:spacing w:before="0" w:after="0"/>
+              <w:jc w:val="center"/>
+            </w:pPr>
+            <w:r>
+              <w:rPr>
+                <w:b/>
+                <w:color w:val="D6EAF8"/>
+                <w:sz w:val="13"/>
+              </w:rPr>
+              <w:t>WEATHER</w:t>
+              <w:br/>
+              <w:t>STATIONS</w:t>
+            </w:r>
+          </w:p>
+        </w:tc>
+        <w:tc>
+          <w:tcPr>
+            <w:tcW w:type="dxa" w:w="2635"/>
+            <w:shd w:val="clear" w:color="auto" w:fill="c0392b"/>
+            <w:tcBorders>
+              <w:top w:val="none"/>
+              <w:left w:val="none"/>
+              <w:bottom w:val="none"/>
+              <w:right w:val="none"/>
+              <w:insideH w:val="none"/>
+              <w:insideV w:val="none"/>
+            </w:tcBorders>
+            <w:tcMar>
+              <w:top w:w="70" w:type="dxa"/>
+              <w:bottom w:w="70" w:type="dxa"/>
+              <w:left w:w="60" w:type="dxa"/>
+              <w:right w:w="60" w:type="dxa"/>
+            </w:tcMar>
+          </w:tcPr>
+          <w:p>
+            <w:pPr>
+              <w:spacing w:before="0" w:after="20"/>
+              <w:jc w:val="center"/>
+            </w:pPr>
+            <w:r>
+              <w:rPr>
+                <w:b/>
+                <w:color w:val="FFFFFF"/>
+                <w:sz w:val="38"/>
+              </w:rPr>
+              <w:t>5+</w:t>
+            </w:r>
+          </w:p>
+          <w:p>
+            <w:pPr>
+              <w:spacing w:before="0" w:after="0"/>
+              <w:jc w:val="center"/>
+            </w:pPr>
+            <w:r>
+              <w:rPr>
+                <w:b/>
+                <w:color w:val="D6EAF8"/>
+                <w:sz w:val="13"/>
+              </w:rPr>
+              <w:t>YEARS OF</w:t>
+              <w:br/>
+              <w:t>TRAINING DATA</w:t>
+            </w:r>
+          </w:p>
+        </w:tc>
+      </w:tr>
+    </w:tbl>
+    <w:p>
+      <w:pPr>
+        <w:spacing w:before="0" w:after="0"/>
+        <w:rPr>
+          <w:sz w:val="2"/>
+          <w:szCs w:val="2"/>
+        </w:rPr>
+      </w:pPr>
+    </w:p>
+    <w:tbl>
+      <w:tblPr>
+        <w:tblW w:type="auto" w:w="0"/>
+        <w:tblLook w:firstColumn="1" w:firstRow="1" w:lastColumn="0" w:lastRow="0" w:noHBand="0" w:noVBand="1" w:val="04A0"/>
+        <w:tblBorders>
+          <w:top w:val="none"/>
+          <w:left w:val="none"/>
+          <w:bottom w:val="none"/>
+          <w:right w:val="none"/>
+          <w:insideH w:val="none"/>
+          <w:insideV w:val="none"/>
+        </w:tblBorders>
+      </w:tblPr>
+      <w:tblGrid>
+        <w:gridCol w:w="1813"/>
+        <w:gridCol w:w="369"/>
+        <w:gridCol w:w="1813"/>
+        <w:gridCol w:w="369"/>
+        <w:gridCol w:w="1813"/>
+        <w:gridCol w:w="369"/>
+        <w:gridCol w:w="1813"/>
+        <w:gridCol w:w="369"/>
+        <w:gridCol w:w="1813"/>
+      </w:tblGrid>
+      <w:tr>
+        <w:tc>
+          <w:tcPr>
+            <w:tcW w:type="dxa" w:w="1171"/>
+            <w:shd w:val="clear" w:color="auto" w:fill="154360"/>
+            <w:tcBorders>
+              <w:top w:val="none"/>
+              <w:left w:val="none"/>
+              <w:bottom w:val="none"/>
+              <w:right w:val="none"/>
+              <w:insideH w:val="none"/>
+              <w:insideV w:val="none"/>
+            </w:tcBorders>
+            <w:tcMar>
+              <w:top w:w="50" w:type="dxa"/>
+              <w:bottom w:w="50" w:type="dxa"/>
+              <w:left w:w="40" w:type="dxa"/>
+              <w:right w:w="40" w:type="dxa"/>
+            </w:tcMar>
+          </w:tcPr>
+          <w:p>
+            <w:pPr>
+              <w:spacing w:before="0" w:after="20"/>
+              <w:jc w:val="center"/>
+            </w:pPr>
+            <w:r>
+              <w:rPr>
+                <w:b/>
+                <w:color w:val="FFFFFF"/>
+                <w:sz w:val="15"/>
+              </w:rPr>
+              <w:t>DATA</w:t>
+            </w:r>
+          </w:p>
+          <w:p>
+            <w:pPr>
+              <w:spacing w:before="0" w:after="0"/>
+              <w:jc w:val="center"/>
+            </w:pPr>
+            <w:r>
+              <w:rPr>
+                <w:i/>
+                <w:color w:val="ADC8E0"/>
+                <w:sz w:val="12"/>
+              </w:rPr>
+              <w:t>Meteostat API</w:t>
+            </w:r>
+          </w:p>
+        </w:tc>
+        <w:tc>
+          <w:tcPr>
+            <w:tcW w:type="dxa" w:w="1171"/>
+            <w:shd w:val="clear" w:color="auto" w:fill="d5d8dc"/>
+            <w:tcBorders>
+              <w:top w:val="none"/>
+              <w:left w:val="none"/>
+              <w:bottom w:val="none"/>
+              <w:right w:val="none"/>
+              <w:insideH w:val="none"/>
+              <w:insideV w:val="none"/>
+            </w:tcBorders>
+            <w:tcMar>
+              <w:top w:w="50" w:type="dxa"/>
+              <w:bottom w:w="50" w:type="dxa"/>
+              <w:left w:w="5" w:type="dxa"/>
+              <w:right w:w="5" w:type="dxa"/>
+            </w:tcMar>
+          </w:tcPr>
+          <w:p>
+            <w:pPr>
+              <w:spacing w:before="200" w:after="0"/>
+              <w:jc w:val="center"/>
+            </w:pPr>
+            <w:r>
+              <w:rPr>
+                <w:color w:val="7F8C8D"/>
+                <w:sz w:val="16"/>
+              </w:rPr>
+              <w:t>▶</w:t>
+            </w:r>
+          </w:p>
+        </w:tc>
+        <w:tc>
+          <w:tcPr>
+            <w:tcW w:type="dxa" w:w="1171"/>
+            <w:shd w:val="clear" w:color="auto" w:fill="1a5276"/>
+            <w:tcBorders>
+              <w:top w:val="none"/>
+              <w:left w:val="none"/>
+              <w:bottom w:val="none"/>
+              <w:right w:val="none"/>
+              <w:insideH w:val="none"/>
+              <w:insideV w:val="none"/>
+            </w:tcBorders>
+            <w:tcMar>
+              <w:top w:w="50" w:type="dxa"/>
+              <w:bottom w:w="50" w:type="dxa"/>
+              <w:left w:w="40" w:type="dxa"/>
+              <w:right w:w="40" w:type="dxa"/>
+            </w:tcMar>
+          </w:tcPr>
+          <w:p>
+            <w:pPr>
+              <w:spacing w:before="0" w:after="20"/>
+              <w:jc w:val="center"/>
+            </w:pPr>
+            <w:r>
+              <w:rPr>
+                <w:b/>
+                <w:color w:val="FFFFFF"/>
+                <w:sz w:val="15"/>
+              </w:rPr>
+              <w:t>PREPROCESS</w:t>
+            </w:r>
+          </w:p>
+          <w:p>
+            <w:pPr>
+              <w:spacing w:before="0" w:after="0"/>
+              <w:jc w:val="center"/>
+            </w:pPr>
+            <w:r>
+              <w:rPr>
+                <w:i/>
+                <w:color w:val="ADC8E0"/>
+                <w:sz w:val="12"/>
+              </w:rPr>
+              <w:t>Clean · Scale · IQR</w:t>
+            </w:r>
+          </w:p>
+        </w:tc>
+        <w:tc>
+          <w:tcPr>
+            <w:tcW w:type="dxa" w:w="1171"/>
+            <w:shd w:val="clear" w:color="auto" w:fill="d5d8dc"/>
+            <w:tcBorders>
+              <w:top w:val="none"/>
+              <w:left w:val="none"/>
+              <w:bottom w:val="none"/>
+              <w:right w:val="none"/>
+              <w:insideH w:val="none"/>
+              <w:insideV w:val="none"/>
+            </w:tcBorders>
+            <w:tcMar>
+              <w:top w:w="50" w:type="dxa"/>
+              <w:bottom w:w="50" w:type="dxa"/>
+              <w:left w:w="5" w:type="dxa"/>
+              <w:right w:w="5" w:type="dxa"/>
+            </w:tcMar>
+          </w:tcPr>
+          <w:p>
+            <w:pPr>
+              <w:spacing w:before="200" w:after="0"/>
+              <w:jc w:val="center"/>
+            </w:pPr>
+            <w:r>
+              <w:rPr>
+                <w:color w:val="7F8C8D"/>
+                <w:sz w:val="16"/>
+              </w:rPr>
+              <w:t>▶</w:t>
+            </w:r>
+          </w:p>
+        </w:tc>
+        <w:tc>
+          <w:tcPr>
+            <w:tcW w:type="dxa" w:w="1171"/>
+            <w:shd w:val="clear" w:color="auto" w:fill="1f3864"/>
+            <w:tcBorders>
+              <w:top w:val="none"/>
+              <w:left w:val="none"/>
+              <w:bottom w:val="none"/>
+              <w:right w:val="none"/>
+              <w:insideH w:val="none"/>
+              <w:insideV w:val="none"/>
+            </w:tcBorders>
+            <w:tcMar>
+              <w:top w:w="50" w:type="dxa"/>
+              <w:bottom w:w="50" w:type="dxa"/>
+              <w:left w:w="40" w:type="dxa"/>
+              <w:right w:w="40" w:type="dxa"/>
+            </w:tcMar>
+          </w:tcPr>
+          <w:p>
+            <w:pPr>
+              <w:spacing w:before="0" w:after="20"/>
+              <w:jc w:val="center"/>
+            </w:pPr>
+            <w:r>
+              <w:rPr>
+                <w:b/>
+                <w:color w:val="FFFFFF"/>
+                <w:sz w:val="15"/>
+              </w:rPr>
+              <w:t>MODELS</w:t>
+            </w:r>
+          </w:p>
+          <w:p>
+            <w:pPr>
+              <w:spacing w:before="0" w:after="0"/>
+              <w:jc w:val="center"/>
+            </w:pPr>
+            <w:r>
+              <w:rPr>
+                <w:i/>
+                <w:color w:val="ADC8E0"/>
+                <w:sz w:val="12"/>
+              </w:rPr>
+              <w:t>GRU·LSTM·RNN·LR·ARIMA</w:t>
+            </w:r>
+          </w:p>
+        </w:tc>
+        <w:tc>
+          <w:tcPr>
+            <w:tcW w:type="dxa" w:w="1171"/>
+            <w:shd w:val="clear" w:color="auto" w:fill="d5d8dc"/>
+            <w:tcBorders>
+              <w:top w:val="none"/>
+              <w:left w:val="none"/>
+              <w:bottom w:val="none"/>
+              <w:right w:val="none"/>
+              <w:insideH w:val="none"/>
+              <w:insideV w:val="none"/>
+            </w:tcBorders>
+            <w:tcMar>
+              <w:top w:w="50" w:type="dxa"/>
+              <w:bottom w:w="50" w:type="dxa"/>
+              <w:left w:w="5" w:type="dxa"/>
+              <w:right w:w="5" w:type="dxa"/>
+            </w:tcMar>
+          </w:tcPr>
+          <w:p>
+            <w:pPr>
+              <w:spacing w:before="200" w:after="0"/>
+              <w:jc w:val="center"/>
+            </w:pPr>
+            <w:r>
+              <w:rPr>
+                <w:color w:val="7F8C8D"/>
+                <w:sz w:val="16"/>
+              </w:rPr>
+              <w:t>▶</w:t>
+            </w:r>
+          </w:p>
+        </w:tc>
+        <w:tc>
+          <w:tcPr>
+            <w:tcW w:type="dxa" w:w="1171"/>
+            <w:shd w:val="clear" w:color="auto" w:fill="4a235a"/>
+            <w:tcBorders>
+              <w:top w:val="none"/>
+              <w:left w:val="none"/>
+              <w:bottom w:val="none"/>
+              <w:right w:val="none"/>
+              <w:insideH w:val="none"/>
+              <w:insideV w:val="none"/>
+            </w:tcBorders>
+            <w:tcMar>
+              <w:top w:w="50" w:type="dxa"/>
+              <w:bottom w:w="50" w:type="dxa"/>
+              <w:left w:w="40" w:type="dxa"/>
+              <w:right w:w="40" w:type="dxa"/>
+            </w:tcMar>
+          </w:tcPr>
+          <w:p>
+            <w:pPr>
+              <w:spacing w:before="0" w:after="20"/>
+              <w:jc w:val="center"/>
+            </w:pPr>
+            <w:r>
+              <w:rPr>
+                <w:b/>
+                <w:color w:val="FFFFFF"/>
+                <w:sz w:val="15"/>
+              </w:rPr>
+              <w:t>EVALUATE</w:t>
+            </w:r>
+          </w:p>
+          <w:p>
+            <w:pPr>
+              <w:spacing w:before="0" w:after="0"/>
+              <w:jc w:val="center"/>
+            </w:pPr>
+            <w:r>
+              <w:rPr>
+                <w:i/>
+                <w:color w:val="ADC8E0"/>
+                <w:sz w:val="12"/>
+              </w:rPr>
+              <w:t>MSE · MAE · R² · Acc</w:t>
+            </w:r>
+          </w:p>
+        </w:tc>
+        <w:tc>
+          <w:tcPr>
+            <w:tcW w:type="dxa" w:w="1171"/>
+            <w:shd w:val="clear" w:color="auto" w:fill="d5d8dc"/>
+            <w:tcBorders>
+              <w:top w:val="none"/>
+              <w:left w:val="none"/>
+              <w:bottom w:val="none"/>
+              <w:right w:val="none"/>
+              <w:insideH w:val="none"/>
+              <w:insideV w:val="none"/>
+            </w:tcBorders>
+            <w:tcMar>
+              <w:top w:w="50" w:type="dxa"/>
+              <w:bottom w:w="50" w:type="dxa"/>
+              <w:left w:w="5" w:type="dxa"/>
+              <w:right w:w="5" w:type="dxa"/>
+            </w:tcMar>
+          </w:tcPr>
+          <w:p>
+            <w:pPr>
+              <w:spacing w:before="200" w:after="0"/>
+              <w:jc w:val="center"/>
+            </w:pPr>
+            <w:r>
+              <w:rPr>
+                <w:color w:val="7F8C8D"/>
+                <w:sz w:val="16"/>
+              </w:rPr>
+              <w:t>▶</w:t>
+            </w:r>
+          </w:p>
+        </w:tc>
+        <w:tc>
+          <w:tcPr>
+            <w:tcW w:type="dxa" w:w="1171"/>
+            <w:shd w:val="clear" w:color="auto" w:fill="145a32"/>
+            <w:tcBorders>
+              <w:top w:val="none"/>
+              <w:left w:val="none"/>
+              <w:bottom w:val="none"/>
+              <w:right w:val="none"/>
+              <w:insideH w:val="none"/>
+              <w:insideV w:val="none"/>
+            </w:tcBorders>
+            <w:tcMar>
+              <w:top w:w="50" w:type="dxa"/>
+              <w:bottom w:w="50" w:type="dxa"/>
+              <w:left w:w="40" w:type="dxa"/>
+              <w:right w:w="40" w:type="dxa"/>
+            </w:tcMar>
+          </w:tcPr>
+          <w:p>
+            <w:pPr>
+              <w:spacing w:before="0" w:after="20"/>
+              <w:jc w:val="center"/>
+            </w:pPr>
+            <w:r>
+              <w:rPr>
+                <w:b/>
+                <w:color w:val="FFFFFF"/>
+                <w:sz w:val="15"/>
+              </w:rPr>
+              <w:t>FORECAST</w:t>
+            </w:r>
+          </w:p>
+          <w:p>
+            <w:pPr>
+              <w:spacing w:before="0" w:after="0"/>
+              <w:jc w:val="center"/>
+            </w:pPr>
+            <w:r>
+              <w:rPr>
+                <w:i/>
+                <w:color w:val="ADC8E0"/>
+                <w:sz w:val="12"/>
+              </w:rPr>
+              <w:t>7-Day Rolling</w:t>
+            </w:r>
+          </w:p>
+        </w:tc>
+      </w:tr>
+    </w:tbl>
+    <w:p>
+      <w:pPr>
+        <w:spacing w:before="0" w:after="0"/>
+        <w:rPr>
+          <w:sz w:val="2"/>
+          <w:szCs w:val="2"/>
+        </w:rPr>
+      </w:pPr>
+    </w:p>
+    <w:tbl>
+      <w:tblPr>
+        <w:tblW w:type="auto" w:w="0"/>
+        <w:tblLook w:firstColumn="1" w:firstRow="1" w:lastColumn="0" w:lastRow="0" w:noHBand="0" w:noVBand="1" w:val="04A0"/>
+        <w:tblBorders>
+          <w:top w:val="none"/>
+          <w:left w:val="none"/>
+          <w:bottom w:val="none"/>
+          <w:right w:val="none"/>
+          <w:insideH w:val="none"/>
+          <w:insideV w:val="none"/>
+        </w:tblBorders>
+      </w:tblPr>
+      <w:tblGrid>
+        <w:gridCol w:w="5159"/>
+        <w:gridCol w:w="5380"/>
+      </w:tblGrid>
+      <w:tr>
+        <w:tc>
+          <w:tcPr>
+            <w:tcW w:type="dxa" w:w="5270"/>
+            <w:tcBorders>
+              <w:top w:val="none"/>
+              <w:left w:val="none"/>
+              <w:bottom w:val="none"/>
+              <w:right w:val="none"/>
+              <w:insideH w:val="none"/>
+              <w:insideV w:val="none"/>
+            </w:tcBorders>
+            <w:tcBorders>
+              <w:right w:val="single" w:sz="6" w:space="0" w:color="bdc3c7"/>
+            </w:tcBorders>
+            <w:tcMar>
+              <w:top w:w="50" w:type="dxa"/>
+              <w:bottom w:w="50" w:type="dxa"/>
+              <w:left w:w="50" w:type="dxa"/>
+              <w:right w:w="140" w:type="dxa"/>
+            </w:tcMar>
           </w:tcPr>
           <w:p/>
           <w:p>
@@ -87,57 +780,57 @@
               <w:rPr>
                 <w:b/>
                 <w:color w:val="1F3864"/>
-                <w:sz w:val="20"/>
+                <w:sz w:val="17"/>
               </w:rPr>
-              <w:t>Overview</w:t>
+              <w:t>●  OVERVIEW</w:t>
             </w:r>
           </w:p>
           <w:p>
             <w:pPr>
-              <w:spacing w:before="0" w:after="60"/>
+              <w:spacing w:before="0" w:after="40"/>
             </w:pPr>
             <w:r>
               <w:rPr>
-                <w:sz w:val="19"/>
+                <w:sz w:val="17"/>
               </w:rPr>
-              <w:t>This system is a web-based platform that fetches real daily weather data from Meteostat and benchmarks five machine learning models — GRU, LSTM, SimpleRNN, Linear Regression, and ARIMA — for multi-variable weather forecasting across two Philippine stations: Baguio City and Manila.</w:t>
+              <w:t>A web-based benchmarking platform that fetches real daily weather data from Meteostat and evaluates five machine learning models for multi-variable weather forecasting across two Philippine stations.</w:t>
             </w:r>
           </w:p>
           <w:p>
             <w:pPr>
-              <w:spacing w:before="160" w:after="40"/>
+              <w:spacing w:before="120" w:after="40"/>
             </w:pPr>
             <w:r>
               <w:rPr>
                 <w:b/>
                 <w:color w:val="1F3864"/>
-                <w:sz w:val="20"/>
+                <w:sz w:val="17"/>
               </w:rPr>
-              <w:t>Problem Statement</w:t>
+              <w:t>●  PROBLEM STATEMENT</w:t>
             </w:r>
           </w:p>
           <w:p>
             <w:pPr>
-              <w:spacing w:before="0" w:after="60"/>
+              <w:spacing w:before="0" w:after="40"/>
             </w:pPr>
             <w:r>
               <w:rPr>
-                <w:sz w:val="19"/>
+                <w:sz w:val="17"/>
               </w:rPr>
-              <w:t>Weather forecasting in the Philippines relies on general-purpose models not specifically benchmarked against local station data. This study evaluates whether GRU, a modern recurrent architecture, outperforms traditional and alternative deep learning approaches for four key meteorological variables.</w:t>
+              <w:t>Philippine weather forecasting relies on general-purpose models not specifically benchmarked on local station data. This study measures whether GRU outperforms alternative deep learning and statistical approaches on four meteorological variables.</w:t>
             </w:r>
           </w:p>
           <w:p>
             <w:pPr>
-              <w:spacing w:before="160" w:after="40"/>
+              <w:spacing w:before="120" w:after="40"/>
             </w:pPr>
             <w:r>
               <w:rPr>
                 <w:b/>
                 <w:color w:val="1F3864"/>
-                <w:sz w:val="20"/>
+                <w:sz w:val="17"/>
               </w:rPr>
-              <w:t>Target Variables</w:t>
+              <w:t>●  TARGET VARIABLES</w:t>
             </w:r>
           </w:p>
           <w:p>
@@ -147,9 +840,9 @@
             </w:pPr>
             <w:r>
               <w:rPr>
-                <w:sz w:val="19"/>
+                <w:sz w:val="17"/>
               </w:rPr>
-              <w:t>Precipitation (prcp) — daily rainfall in mm</w:t>
+              <w:t>Precipitation (prcp)  —  daily rainfall, mm</w:t>
             </w:r>
           </w:p>
           <w:p>
@@ -159,9 +852,9 @@
             </w:pPr>
             <w:r>
               <w:rPr>
-                <w:sz w:val="19"/>
+                <w:sz w:val="17"/>
               </w:rPr>
-              <w:t>Temperature (temp)   — average daily temperature in °C</w:t>
+              <w:t>Temperature (tavg)     —  average daily temp, °C</w:t>
             </w:r>
           </w:p>
           <w:p>
@@ -171,9 +864,9 @@
             </w:pPr>
             <w:r>
               <w:rPr>
-                <w:sz w:val="19"/>
+                <w:sz w:val="17"/>
               </w:rPr>
-              <w:t>Wind Speed (wspd)    — average daily wind speed in km/h</w:t>
+              <w:t>Wind Speed (wspd)     —  average wind speed, km/h</w:t>
             </w:r>
           </w:p>
           <w:p>
@@ -183,22 +876,22 @@
             </w:pPr>
             <w:r>
               <w:rPr>
-                <w:sz w:val="19"/>
+                <w:sz w:val="17"/>
               </w:rPr>
-              <w:t>Pressure (pres)      — mean sea-level pressure in hPa</w:t>
+              <w:t>Pressure (pres)          —  sea-level pressure, hPa</w:t>
             </w:r>
           </w:p>
           <w:p>
             <w:pPr>
-              <w:spacing w:before="160" w:after="40"/>
+              <w:spacing w:before="120" w:after="40"/>
             </w:pPr>
             <w:r>
               <w:rPr>
                 <w:b/>
                 <w:color w:val="1F3864"/>
-                <w:sz w:val="20"/>
+                <w:sz w:val="17"/>
               </w:rPr>
-              <w:t>Stations Covered</w:t>
+              <w:t>●  STATIONS COVERED</w:t>
             </w:r>
           </w:p>
           <w:p>
@@ -208,7 +901,7 @@
             </w:pPr>
             <w:r>
               <w:rPr>
-                <w:sz w:val="19"/>
+                <w:sz w:val="17"/>
               </w:rPr>
               <w:t>Baguio City  (Meteostat Station ID: 98328)</w:t>
             </w:r>
@@ -220,39 +913,63 @@
             </w:pPr>
             <w:r>
               <w:rPr>
-                <w:sz w:val="19"/>
+                <w:sz w:val="17"/>
               </w:rPr>
               <w:t>Manila           (Meteostat Station ID: 98425)</w:t>
             </w:r>
           </w:p>
           <w:p>
             <w:pPr>
-              <w:spacing w:before="160" w:after="40"/>
+              <w:spacing w:before="120" w:after="40"/>
             </w:pPr>
             <w:r>
               <w:rPr>
                 <w:b/>
                 <w:color w:val="1F3864"/>
-                <w:sz w:val="20"/>
+                <w:sz w:val="17"/>
               </w:rPr>
-              <w:t>Data Source &amp; Period</w:t>
+              <w:t>●  DATA PERIOD</w:t>
             </w:r>
           </w:p>
           <w:p>
             <w:pPr>
-              <w:spacing w:before="0" w:after="60"/>
+              <w:spacing w:before="0" w:after="40"/>
             </w:pPr>
             <w:r>
               <w:rPr>
-                <w:sz w:val="19"/>
+                <w:sz w:val="17"/>
               </w:rPr>
               <w:t>Meteostat Open Weather API  ·  January 1, 2020 — Present (dynamic)</w:t>
+            </w:r>
+          </w:p>
+          <w:p>
+            <w:pPr>
+              <w:spacing w:before="120" w:after="40"/>
+            </w:pPr>
+            <w:r>
+              <w:rPr>
+                <w:b/>
+                <w:color w:val="1F3864"/>
+                <w:sz w:val="17"/>
+              </w:rPr>
+              <w:t>●  METHODOLOGY</w:t>
+            </w:r>
+          </w:p>
+          <w:p>
+            <w:pPr>
+              <w:spacing w:before="0" w:after="0"/>
+            </w:pPr>
+            <w:r>
+              <w:rPr>
+                <w:sz w:val="17"/>
+              </w:rPr>
+              <w:t>Data cleaned via IQR outlier removal and MinMax scaling. Deep learning models use sliding-window sequences (seq_len=30) with early stopping (patience=20). Results cached for instant reload.</w:t>
             </w:r>
           </w:p>
         </w:tc>
         <w:tc>
           <w:tcPr>
-            <w:tcW w:type="dxa" w:w="4873"/>
+            <w:tcW w:type="dxa" w:w="5270"/>
             <w:tcBorders>
               <w:top w:val="none"/>
               <w:left w:val="none"/>
@@ -261,6 +978,12 @@
               <w:insideH w:val="none"/>
               <w:insideV w:val="none"/>
             </w:tcBorders>
+            <w:tcMar>
+              <w:top w:w="50" w:type="dxa"/>
+              <w:bottom w:w="50" w:type="dxa"/>
+              <w:left w:w="140" w:type="dxa"/>
+              <w:right w:w="50" w:type="dxa"/>
+            </w:tcMar>
           </w:tcPr>
           <w:p/>
           <w:p>
@@ -271,9 +994,231 @@
               <w:rPr>
                 <w:b/>
                 <w:color w:val="1F3864"/>
-                <w:sz w:val="20"/>
+                <w:sz w:val="17"/>
               </w:rPr>
-              <w:t>Models Compared</w:t>
+              <w:t>●  MODELS COMPARED</w:t>
+            </w:r>
+          </w:p>
+          <w:tbl>
+            <w:tblPr>
+              <w:tblW w:type="auto" w:w="0"/>
+              <w:tblLook w:firstColumn="1" w:firstRow="1" w:lastColumn="0" w:lastRow="0" w:noHBand="0" w:noVBand="1" w:val="04A0"/>
+              <w:tblBorders>
+                <w:top w:val="none"/>
+                <w:left w:val="none"/>
+                <w:bottom w:val="none"/>
+                <w:right w:val="none"/>
+                <w:insideH w:val="none"/>
+                <w:insideV w:val="none"/>
+              </w:tblBorders>
+            </w:tblPr>
+            <w:tblGrid>
+              <w:gridCol w:w="1076"/>
+              <w:gridCol w:w="1076"/>
+              <w:gridCol w:w="1076"/>
+              <w:gridCol w:w="1076"/>
+              <w:gridCol w:w="1076"/>
+            </w:tblGrid>
+            <w:tr>
+              <w:tc>
+                <w:tcPr>
+                  <w:tcW w:type="dxa" w:w="1054"/>
+                  <w:shd w:val="clear" w:color="auto" w:fill="1f77b4"/>
+                  <w:tcBorders>
+                    <w:top w:val="none"/>
+                    <w:left w:val="none"/>
+                    <w:bottom w:val="none"/>
+                    <w:right w:val="none"/>
+                    <w:insideH w:val="none"/>
+                    <w:insideV w:val="none"/>
+                  </w:tcBorders>
+                  <w:tcMar>
+                    <w:top w:w="45" w:type="dxa"/>
+                    <w:bottom w:w="45" w:type="dxa"/>
+                    <w:left w:w="40" w:type="dxa"/>
+                    <w:right w:w="40" w:type="dxa"/>
+                  </w:tcMar>
+                </w:tcPr>
+                <w:p>
+                  <w:pPr>
+                    <w:spacing w:before="0" w:after="0"/>
+                    <w:jc w:val="center"/>
+                  </w:pPr>
+                  <w:r>
+                    <w:rPr>
+                      <w:b/>
+                      <w:color w:val="FFFFFF"/>
+                      <w:sz w:val="15"/>
+                    </w:rPr>
+                    <w:t>GRU</w:t>
+                  </w:r>
+                </w:p>
+              </w:tc>
+              <w:tc>
+                <w:tcPr>
+                  <w:tcW w:type="dxa" w:w="1054"/>
+                  <w:shd w:val="clear" w:color="auto" w:fill="ff7f0e"/>
+                  <w:tcBorders>
+                    <w:top w:val="none"/>
+                    <w:left w:val="none"/>
+                    <w:bottom w:val="none"/>
+                    <w:right w:val="none"/>
+                    <w:insideH w:val="none"/>
+                    <w:insideV w:val="none"/>
+                  </w:tcBorders>
+                  <w:tcMar>
+                    <w:top w:w="45" w:type="dxa"/>
+                    <w:bottom w:w="45" w:type="dxa"/>
+                    <w:left w:w="40" w:type="dxa"/>
+                    <w:right w:w="40" w:type="dxa"/>
+                  </w:tcMar>
+                </w:tcPr>
+                <w:p>
+                  <w:pPr>
+                    <w:spacing w:before="0" w:after="0"/>
+                    <w:jc w:val="center"/>
+                  </w:pPr>
+                  <w:r>
+                    <w:rPr>
+                      <w:b/>
+                      <w:color w:val="FFFFFF"/>
+                      <w:sz w:val="15"/>
+                    </w:rPr>
+                    <w:t>LSTM</w:t>
+                  </w:r>
+                </w:p>
+              </w:tc>
+              <w:tc>
+                <w:tcPr>
+                  <w:tcW w:type="dxa" w:w="1054"/>
+                  <w:shd w:val="clear" w:color="auto" w:fill="2ca02c"/>
+                  <w:tcBorders>
+                    <w:top w:val="none"/>
+                    <w:left w:val="none"/>
+                    <w:bottom w:val="none"/>
+                    <w:right w:val="none"/>
+                    <w:insideH w:val="none"/>
+                    <w:insideV w:val="none"/>
+                  </w:tcBorders>
+                  <w:tcMar>
+                    <w:top w:w="45" w:type="dxa"/>
+                    <w:bottom w:w="45" w:type="dxa"/>
+                    <w:left w:w="40" w:type="dxa"/>
+                    <w:right w:w="40" w:type="dxa"/>
+                  </w:tcMar>
+                </w:tcPr>
+                <w:p>
+                  <w:pPr>
+                    <w:spacing w:before="0" w:after="0"/>
+                    <w:jc w:val="center"/>
+                  </w:pPr>
+                  <w:r>
+                    <w:rPr>
+                      <w:b/>
+                      <w:color w:val="FFFFFF"/>
+                      <w:sz w:val="15"/>
+                    </w:rPr>
+                    <w:t>SimpleRNN</w:t>
+                  </w:r>
+                </w:p>
+              </w:tc>
+              <w:tc>
+                <w:tcPr>
+                  <w:tcW w:type="dxa" w:w="1054"/>
+                  <w:shd w:val="clear" w:color="auto" w:fill="d62728"/>
+                  <w:tcBorders>
+                    <w:top w:val="none"/>
+                    <w:left w:val="none"/>
+                    <w:bottom w:val="none"/>
+                    <w:right w:val="none"/>
+                    <w:insideH w:val="none"/>
+                    <w:insideV w:val="none"/>
+                  </w:tcBorders>
+                  <w:tcMar>
+                    <w:top w:w="45" w:type="dxa"/>
+                    <w:bottom w:w="45" w:type="dxa"/>
+                    <w:left w:w="40" w:type="dxa"/>
+                    <w:right w:w="40" w:type="dxa"/>
+                  </w:tcMar>
+                </w:tcPr>
+                <w:p>
+                  <w:pPr>
+                    <w:spacing w:before="0" w:after="0"/>
+                    <w:jc w:val="center"/>
+                  </w:pPr>
+                  <w:r>
+                    <w:rPr>
+                      <w:b/>
+                      <w:color w:val="FFFFFF"/>
+                      <w:sz w:val="15"/>
+                    </w:rPr>
+                    <w:t>Linear Regression</w:t>
+                  </w:r>
+                </w:p>
+              </w:tc>
+              <w:tc>
+                <w:tcPr>
+                  <w:tcW w:type="dxa" w:w="1054"/>
+                  <w:shd w:val="clear" w:color="auto" w:fill="9467bd"/>
+                  <w:tcBorders>
+                    <w:top w:val="none"/>
+                    <w:left w:val="none"/>
+                    <w:bottom w:val="none"/>
+                    <w:right w:val="none"/>
+                    <w:insideH w:val="none"/>
+                    <w:insideV w:val="none"/>
+                  </w:tcBorders>
+                  <w:tcMar>
+                    <w:top w:w="45" w:type="dxa"/>
+                    <w:bottom w:w="45" w:type="dxa"/>
+                    <w:left w:w="40" w:type="dxa"/>
+                    <w:right w:w="40" w:type="dxa"/>
+                  </w:tcMar>
+                </w:tcPr>
+                <w:p>
+                  <w:pPr>
+                    <w:spacing w:before="0" w:after="0"/>
+                    <w:jc w:val="center"/>
+                  </w:pPr>
+                  <w:r>
+                    <w:rPr>
+                      <w:b/>
+                      <w:color w:val="FFFFFF"/>
+                      <w:sz w:val="15"/>
+                    </w:rPr>
+                    <w:t>ARIMA</w:t>
+                  </w:r>
+                </w:p>
+              </w:tc>
+            </w:tr>
+          </w:tbl>
+          <w:p/>
+          <w:p>
+            <w:pPr>
+              <w:spacing w:before="40" w:after="40"/>
+            </w:pPr>
+            <w:r>
+              <w:rPr>
+                <w:i/>
+                <w:color w:val="555555"/>
+                <w:sz w:val="15"/>
+              </w:rPr>
+              <w:t>GRU &amp; LSTM: 3-layer Bidirectional, hidden=256, dropout=0.2, epochs=200</w:t>
+              <w:br/>
+              <w:t>SimpleRNN: Unidirectional  ·  LR: flattened multivariate  ·  ARIMA: auto_arima (AIC)</w:t>
+            </w:r>
+          </w:p>
+          <w:p>
+            <w:pPr>
+              <w:spacing w:before="120" w:after="40"/>
+            </w:pPr>
+            <w:r>
+              <w:rPr>
+                <w:b/>
+                <w:color w:val="1F3864"/>
+                <w:sz w:val="17"/>
+              </w:rPr>
+              <w:t>●  EVALUATION METRICS</w:t>
             </w:r>
           </w:p>
           <w:p>
@@ -283,80 +1228,7 @@
             </w:pPr>
             <w:r>
               <w:rPr>
-                <w:sz w:val="19"/>
-              </w:rPr>
-              <w:t>GRU            — 3-layer Bidirectional, hidden=256</w:t>
-            </w:r>
-          </w:p>
-          <w:p>
-            <w:pPr>
-              <w:pStyle w:val="ListBullet"/>
-              <w:spacing w:before="0" w:after="20"/>
-            </w:pPr>
-            <w:r>
-              <w:rPr>
-                <w:sz w:val="19"/>
-              </w:rPr>
-              <w:t>LSTM          — 3-layer Bidirectional, hidden=256</w:t>
-            </w:r>
-          </w:p>
-          <w:p>
-            <w:pPr>
-              <w:pStyle w:val="ListBullet"/>
-              <w:spacing w:before="0" w:after="20"/>
-            </w:pPr>
-            <w:r>
-              <w:rPr>
-                <w:sz w:val="19"/>
-              </w:rPr>
-              <w:t>SimpleRNN  — 3-layer Unidirectional, hidden=256</w:t>
-            </w:r>
-          </w:p>
-          <w:p>
-            <w:pPr>
-              <w:pStyle w:val="ListBullet"/>
-              <w:spacing w:before="0" w:after="20"/>
-            </w:pPr>
-            <w:r>
-              <w:rPr>
-                <w:sz w:val="19"/>
-              </w:rPr>
-              <w:t>Linear Regression  — flattened-sequence multivariate</w:t>
-            </w:r>
-          </w:p>
-          <w:p>
-            <w:pPr>
-              <w:pStyle w:val="ListBullet"/>
-              <w:spacing w:before="0" w:after="20"/>
-            </w:pPr>
-            <w:r>
-              <w:rPr>
-                <w:sz w:val="19"/>
-              </w:rPr>
-              <w:t>ARIMA        — auto_arima (AIC, stepwise, seasonal=False)</w:t>
-            </w:r>
-          </w:p>
-          <w:p>
-            <w:pPr>
-              <w:spacing w:before="160" w:after="40"/>
-            </w:pPr>
-            <w:r>
-              <w:rPr>
-                <w:b/>
-                <w:color w:val="1F3864"/>
-                <w:sz w:val="20"/>
-              </w:rPr>
-              <w:t>Evaluation Metrics</w:t>
-            </w:r>
-          </w:p>
-          <w:p>
-            <w:pPr>
-              <w:pStyle w:val="ListBullet"/>
-              <w:spacing w:before="0" w:after="20"/>
-            </w:pPr>
-            <w:r>
-              <w:rPr>
-                <w:sz w:val="19"/>
+                <w:sz w:val="17"/>
               </w:rPr>
               <w:t>Accuracy (%)  =  100 − MAPE</w:t>
             </w:r>
@@ -368,7 +1240,7 @@
             </w:pPr>
             <w:r>
               <w:rPr>
-                <w:sz w:val="19"/>
+                <w:sz w:val="17"/>
               </w:rPr>
               <w:t>Mean Squared Error (MSE)</w:t>
             </w:r>
@@ -380,7 +1252,7 @@
             </w:pPr>
             <w:r>
               <w:rPr>
-                <w:sz w:val="19"/>
+                <w:sz w:val="17"/>
               </w:rPr>
               <w:t>Mean Absolute Error (MAE)</w:t>
             </w:r>
@@ -392,45 +1264,66 @@
             </w:pPr>
             <w:r>
               <w:rPr>
-                <w:sz w:val="19"/>
+                <w:sz w:val="17"/>
               </w:rPr>
               <w:t>Coefficient of Determination (R²)</w:t>
             </w:r>
           </w:p>
           <w:p>
             <w:pPr>
-              <w:spacing w:before="160" w:after="40"/>
+              <w:spacing w:before="120" w:after="40"/>
             </w:pPr>
             <w:r>
               <w:rPr>
                 <w:b/>
                 <w:color w:val="1F3864"/>
-                <w:sz w:val="20"/>
+                <w:sz w:val="17"/>
               </w:rPr>
-              <w:t>Technology Stack</w:t>
+              <w:t>●  TECHNOLOGY STACK</w:t>
             </w:r>
           </w:p>
           <w:tbl>
             <w:tblPr>
               <w:tblW w:type="auto" w:w="0"/>
-              <w:jc w:val="left"/>
               <w:tblLook w:firstColumn="1" w:firstRow="1" w:lastColumn="0" w:lastRow="0" w:noHBand="0" w:noVBand="1" w:val="04A0"/>
+              <w:tblBorders>
+                <w:top w:val="none"/>
+                <w:left w:val="none"/>
+                <w:bottom w:val="none"/>
+                <w:right w:val="none"/>
+                <w:insideH w:val="none"/>
+                <w:insideV w:val="none"/>
+              </w:tblBorders>
             </w:tblPr>
             <w:tblGrid>
-              <w:gridCol w:w="2436"/>
-              <w:gridCol w:w="2436"/>
+              <w:gridCol w:w="1701"/>
+              <w:gridCol w:w="3679"/>
             </w:tblGrid>
             <w:tr>
               <w:tc>
                 <w:tcPr>
-                  <w:tcW w:type="dxa" w:w="1701"/>
+                  <w:tcW w:type="dxa" w:w="2635"/>
                   <w:shd w:val="clear" w:color="auto" w:fill="eaf0fb"/>
+                  <w:tcBorders>
+                    <w:top w:val="none"/>
+                    <w:left w:val="none"/>
+                    <w:bottom w:val="none"/>
+                    <w:right w:val="none"/>
+                    <w:insideH w:val="none"/>
+                    <w:insideV w:val="none"/>
+                  </w:tcBorders>
+                  <w:tcMar>
+                    <w:top w:w="28" w:type="dxa"/>
+                    <w:bottom w:w="28" w:type="dxa"/>
+                    <w:left w:w="80" w:type="dxa"/>
+                    <w:right w:w="40" w:type="dxa"/>
+                  </w:tcMar>
                 </w:tcPr>
                 <w:p>
                   <w:r>
                     <w:rPr>
                       <w:b/>
-                      <w:sz w:val="17"/>
+                      <w:sz w:val="16"/>
                     </w:rPr>
                     <w:t>Language</w:t>
                   </w:r>
@@ -438,13 +1331,27 @@
               </w:tc>
               <w:tc>
                 <w:tcPr>
-                  <w:tcW w:type="dxa" w:w="2608"/>
+                  <w:tcW w:type="dxa" w:w="2635"/>
                   <w:shd w:val="clear" w:color="auto" w:fill="eaf0fb"/>
+                  <w:tcBorders>
+                    <w:top w:val="none"/>
+                    <w:left w:val="none"/>
+                    <w:bottom w:val="none"/>
+                    <w:right w:val="none"/>
+                    <w:insideH w:val="none"/>
+                    <w:insideV w:val="none"/>
+                  </w:tcBorders>
+                  <w:tcMar>
+                    <w:top w:w="28" w:type="dxa"/>
+                    <w:bottom w:w="28" w:type="dxa"/>
+                    <w:left w:w="40" w:type="dxa"/>
+                    <w:right w:w="80" w:type="dxa"/>
+                  </w:tcMar>
                 </w:tcPr>
                 <w:p>
                   <w:r>
                     <w:rPr>
-                      <w:sz w:val="17"/>
+                      <w:sz w:val="16"/>
                     </w:rPr>
                     <w:t>Python 3.10+</w:t>
                   </w:r>
@@ -454,14 +1361,28 @@
             <w:tr>
               <w:tc>
                 <w:tcPr>
-                  <w:tcW w:type="dxa" w:w="1701"/>
+                  <w:tcW w:type="dxa" w:w="2635"/>
                   <w:shd w:val="clear" w:color="auto" w:fill="ffffff"/>
+                  <w:tcBorders>
+                    <w:top w:val="none"/>
+                    <w:left w:val="none"/>
+                    <w:bottom w:val="none"/>
+                    <w:right w:val="none"/>
+                    <w:insideH w:val="none"/>
+                    <w:insideV w:val="none"/>
+                  </w:tcBorders>
+                  <w:tcMar>
+                    <w:top w:w="28" w:type="dxa"/>
+                    <w:bottom w:w="28" w:type="dxa"/>
+                    <w:left w:w="80" w:type="dxa"/>
+                    <w:right w:w="40" w:type="dxa"/>
+                  </w:tcMar>
                 </w:tcPr>
                 <w:p>
                   <w:r>
                     <w:rPr>
                       <w:b/>
-                      <w:sz w:val="17"/>
+                      <w:sz w:val="16"/>
                     </w:rPr>
                     <w:t>Deep Learning</w:t>
                   </w:r>
@@ -469,15 +1390,29 @@
               </w:tc>
               <w:tc>
                 <w:tcPr>
-                  <w:tcW w:type="dxa" w:w="2608"/>
+                  <w:tcW w:type="dxa" w:w="2635"/>
                   <w:shd w:val="clear" w:color="auto" w:fill="ffffff"/>
+                  <w:tcBorders>
+                    <w:top w:val="none"/>
+                    <w:left w:val="none"/>
+                    <w:bottom w:val="none"/>
+                    <w:right w:val="none"/>
+                    <w:insideH w:val="none"/>
+                    <w:insideV w:val="none"/>
+                  </w:tcBorders>
+                  <w:tcMar>
+                    <w:top w:w="28" w:type="dxa"/>
+                    <w:bottom w:w="28" w:type="dxa"/>
+                    <w:left w:w="40" w:type="dxa"/>
+                    <w:right w:w="80" w:type="dxa"/>
+                  </w:tcMar>
                 </w:tcPr>
                 <w:p>
                   <w:r>
                     <w:rPr>
-                      <w:sz w:val="17"/>
+                      <w:sz w:val="16"/>
                     </w:rPr>
-                    <w:t>PyTorch 2.x (CUDA / MPS / CPU)</w:t>
+                    <w:t>PyTorch 2.x  (CUDA / MPS / CPU)</w:t>
                   </w:r>
                 </w:p>
               </w:tc>
@@ -485,14 +1420,28 @@
             <w:tr>
               <w:tc>
                 <w:tcPr>
-                  <w:tcW w:type="dxa" w:w="1701"/>
+                  <w:tcW w:type="dxa" w:w="2635"/>
                   <w:shd w:val="clear" w:color="auto" w:fill="eaf0fb"/>
+                  <w:tcBorders>
+                    <w:top w:val="none"/>
+                    <w:left w:val="none"/>
+                    <w:bottom w:val="none"/>
+                    <w:right w:val="none"/>
+                    <w:insideH w:val="none"/>
+                    <w:insideV w:val="none"/>
+                  </w:tcBorders>
+                  <w:tcMar>
+                    <w:top w:w="28" w:type="dxa"/>
+                    <w:bottom w:w="28" w:type="dxa"/>
+                    <w:left w:w="80" w:type="dxa"/>
+                    <w:right w:w="40" w:type="dxa"/>
+                  </w:tcMar>
                 </w:tcPr>
                 <w:p>
                   <w:r>
                     <w:rPr>
                       <w:b/>
-                      <w:sz w:val="17"/>
+                      <w:sz w:val="16"/>
                     </w:rPr>
                     <w:t>ARIMA</w:t>
                   </w:r>
@@ -500,15 +1449,29 @@
               </w:tc>
               <w:tc>
                 <w:tcPr>
-                  <w:tcW w:type="dxa" w:w="2608"/>
+                  <w:tcW w:type="dxa" w:w="2635"/>
                   <w:shd w:val="clear" w:color="auto" w:fill="eaf0fb"/>
+                  <w:tcBorders>
+                    <w:top w:val="none"/>
+                    <w:left w:val="none"/>
+                    <w:bottom w:val="none"/>
+                    <w:right w:val="none"/>
+                    <w:insideH w:val="none"/>
+                    <w:insideV w:val="none"/>
+                  </w:tcBorders>
+                  <w:tcMar>
+                    <w:top w:w="28" w:type="dxa"/>
+                    <w:bottom w:w="28" w:type="dxa"/>
+                    <w:left w:w="40" w:type="dxa"/>
+                    <w:right w:w="80" w:type="dxa"/>
+                  </w:tcMar>
                 </w:tcPr>
                 <w:p>
                   <w:r>
                     <w:rPr>
-                      <w:sz w:val="17"/>
+                      <w:sz w:val="16"/>
                     </w:rPr>
-                    <w:t>pmdarima (auto_arima)</w:t>
+                    <w:t>pmdarima  auto_arima</w:t>
                   </w:r>
                 </w:p>
               </w:tc>
@@ -516,14 +1479,28 @@
             <w:tr>
               <w:tc>
                 <w:tcPr>
-                  <w:tcW w:type="dxa" w:w="1701"/>
+                  <w:tcW w:type="dxa" w:w="2635"/>
                   <w:shd w:val="clear" w:color="auto" w:fill="ffffff"/>
+                  <w:tcBorders>
+                    <w:top w:val="none"/>
+                    <w:left w:val="none"/>
+                    <w:bottom w:val="none"/>
+                    <w:right w:val="none"/>
+                    <w:insideH w:val="none"/>
+                    <w:insideV w:val="none"/>
+                  </w:tcBorders>
+                  <w:tcMar>
+                    <w:top w:w="28" w:type="dxa"/>
+                    <w:bottom w:w="28" w:type="dxa"/>
+                    <w:left w:w="80" w:type="dxa"/>
+                    <w:right w:w="40" w:type="dxa"/>
+                  </w:tcMar>
                 </w:tcPr>
                 <w:p>
                   <w:r>
                     <w:rPr>
                       <w:b/>
-                      <w:sz w:val="17"/>
+                      <w:sz w:val="16"/>
                     </w:rPr>
                     <w:t>Data</w:t>
                   </w:r>
@@ -531,13 +1508,27 @@
               </w:tc>
               <w:tc>
                 <w:tcPr>
-                  <w:tcW w:type="dxa" w:w="2608"/>
+                  <w:tcW w:type="dxa" w:w="2635"/>
                   <w:shd w:val="clear" w:color="auto" w:fill="ffffff"/>
+                  <w:tcBorders>
+                    <w:top w:val="none"/>
+                    <w:left w:val="none"/>
+                    <w:bottom w:val="none"/>
+                    <w:right w:val="none"/>
+                    <w:insideH w:val="none"/>
+                    <w:insideV w:val="none"/>
+                  </w:tcBorders>
+                  <w:tcMar>
+                    <w:top w:w="28" w:type="dxa"/>
+                    <w:bottom w:w="28" w:type="dxa"/>
+                    <w:left w:w="40" w:type="dxa"/>
+                    <w:right w:w="80" w:type="dxa"/>
+                  </w:tcMar>
                 </w:tcPr>
                 <w:p>
                   <w:r>
                     <w:rPr>
-                      <w:sz w:val="17"/>
+                      <w:sz w:val="16"/>
                     </w:rPr>
                     <w:t>Meteostat API</w:t>
                   </w:r>
@@ -547,14 +1538,28 @@
             <w:tr>
               <w:tc>
                 <w:tcPr>
-                  <w:tcW w:type="dxa" w:w="1701"/>
+                  <w:tcW w:type="dxa" w:w="2635"/>
                   <w:shd w:val="clear" w:color="auto" w:fill="eaf0fb"/>
+                  <w:tcBorders>
+                    <w:top w:val="none"/>
+                    <w:left w:val="none"/>
+                    <w:bottom w:val="none"/>
+                    <w:right w:val="none"/>
+                    <w:insideH w:val="none"/>
+                    <w:insideV w:val="none"/>
+                  </w:tcBorders>
+                  <w:tcMar>
+                    <w:top w:w="28" w:type="dxa"/>
+                    <w:bottom w:w="28" w:type="dxa"/>
+                    <w:left w:w="80" w:type="dxa"/>
+                    <w:right w:w="40" w:type="dxa"/>
+                  </w:tcMar>
                 </w:tcPr>
                 <w:p>
                   <w:r>
                     <w:rPr>
                       <w:b/>
-                      <w:sz w:val="17"/>
+                      <w:sz w:val="16"/>
                     </w:rPr>
                     <w:t>Preprocessing</w:t>
                   </w:r>
@@ -562,15 +1567,29 @@
               </w:tc>
               <w:tc>
                 <w:tcPr>
-                  <w:tcW w:type="dxa" w:w="2608"/>
+                  <w:tcW w:type="dxa" w:w="2635"/>
                   <w:shd w:val="clear" w:color="auto" w:fill="eaf0fb"/>
+                  <w:tcBorders>
+                    <w:top w:val="none"/>
+                    <w:left w:val="none"/>
+                    <w:bottom w:val="none"/>
+                    <w:right w:val="none"/>
+                    <w:insideH w:val="none"/>
+                    <w:insideV w:val="none"/>
+                  </w:tcBorders>
+                  <w:tcMar>
+                    <w:top w:w="28" w:type="dxa"/>
+                    <w:bottom w:w="28" w:type="dxa"/>
+                    <w:left w:w="40" w:type="dxa"/>
+                    <w:right w:w="80" w:type="dxa"/>
+                  </w:tcMar>
                 </w:tcPr>
                 <w:p>
                   <w:r>
                     <w:rPr>
-                      <w:sz w:val="17"/>
+                      <w:sz w:val="16"/>
                     </w:rPr>
-                    <w:t>scikit-learn, pandas, NumPy</w:t>
+                    <w:t>scikit-learn  ·  pandas  ·  NumPy</w:t>
                   </w:r>
                 </w:p>
               </w:tc>
@@ -578,61 +1597,58 @@
             <w:tr>
               <w:tc>
                 <w:tcPr>
-                  <w:tcW w:type="dxa" w:w="1701"/>
+                  <w:tcW w:type="dxa" w:w="2635"/>
                   <w:shd w:val="clear" w:color="auto" w:fill="ffffff"/>
+                  <w:tcBorders>
+                    <w:top w:val="none"/>
+                    <w:left w:val="none"/>
+                    <w:bottom w:val="none"/>
+                    <w:right w:val="none"/>
+                    <w:insideH w:val="none"/>
+                    <w:insideV w:val="none"/>
+                  </w:tcBorders>
+                  <w:tcMar>
+                    <w:top w:w="28" w:type="dxa"/>
+                    <w:bottom w:w="28" w:type="dxa"/>
+                    <w:left w:w="80" w:type="dxa"/>
+                    <w:right w:w="40" w:type="dxa"/>
+                  </w:tcMar>
                 </w:tcPr>
                 <w:p>
                   <w:r>
                     <w:rPr>
                       <w:b/>
-                      <w:sz w:val="17"/>
+                      <w:sz w:val="16"/>
                     </w:rPr>
-                    <w:t>Web UI</w:t>
+                    <w:t>UI / Plots</w:t>
                   </w:r>
                 </w:p>
               </w:tc>
               <w:tc>
                 <w:tcPr>
-                  <w:tcW w:type="dxa" w:w="2608"/>
+                  <w:tcW w:type="dxa" w:w="2635"/>
                   <w:shd w:val="clear" w:color="auto" w:fill="ffffff"/>
+                  <w:tcBorders>
+                    <w:top w:val="none"/>
+                    <w:left w:val="none"/>
+                    <w:bottom w:val="none"/>
+                    <w:right w:val="none"/>
+                    <w:insideH w:val="none"/>
+                    <w:insideV w:val="none"/>
+                  </w:tcBorders>
+                  <w:tcMar>
+                    <w:top w:w="28" w:type="dxa"/>
+                    <w:bottom w:w="28" w:type="dxa"/>
+                    <w:left w:w="40" w:type="dxa"/>
+                    <w:right w:w="80" w:type="dxa"/>
+                  </w:tcMar>
                 </w:tcPr>
                 <w:p>
                   <w:r>
                     <w:rPr>
-                      <w:sz w:val="17"/>
+                      <w:sz w:val="16"/>
                     </w:rPr>
-                    <w:t>Streamlit</w:t>
-                  </w:r>
-                </w:p>
-              </w:tc>
-            </w:tr>
-            <w:tr>
-              <w:tc>
-                <w:tcPr>
-                  <w:tcW w:type="dxa" w:w="1701"/>
-                  <w:shd w:val="clear" w:color="auto" w:fill="eaf0fb"/>
-                </w:tcPr>
-                <w:p>
-                  <w:r>
-                    <w:rPr>
-                      <w:b/>
-                      <w:sz w:val="17"/>
-                    </w:rPr>
-                    <w:t>Plots</w:t>
-                  </w:r>
-                </w:p>
-              </w:tc>
-              <w:tc>
-                <w:tcPr>
-                  <w:tcW w:type="dxa" w:w="2608"/>
-                  <w:shd w:val="clear" w:color="auto" w:fill="eaf0fb"/>
-                </w:tcPr>
-                <w:p>
-                  <w:r>
-                    <w:rPr>
-                      <w:sz w:val="17"/>
-                    </w:rPr>
-                    <w:t>Matplotlib</w:t>
+                    <w:t>Streamlit  ·  Matplotlib</w:t>
                   </w:r>
                 </w:p>
               </w:tc>
@@ -641,95 +1657,188 @@
           <w:p/>
           <w:p>
             <w:pPr>
-              <w:spacing w:before="160" w:after="40"/>
+              <w:spacing w:before="120" w:after="40"/>
             </w:pPr>
             <w:r>
               <w:rPr>
                 <w:b/>
                 <w:color w:val="1F3864"/>
-                <w:sz w:val="20"/>
+                <w:sz w:val="17"/>
               </w:rPr>
-              <w:t>Live Demo</w:t>
+              <w:t>●  LIVE DEMO &amp; SOURCE CODE</w:t>
             </w:r>
           </w:p>
+          <w:tbl>
+            <w:tblPr>
+              <w:tblW w:type="auto" w:w="0"/>
+              <w:tblLook w:firstColumn="1" w:firstRow="1" w:lastColumn="0" w:lastRow="0" w:noHBand="0" w:noVBand="1" w:val="04A0"/>
+              <w:tblBorders>
+                <w:top w:val="none"/>
+                <w:left w:val="none"/>
+                <w:bottom w:val="none"/>
+                <w:right w:val="none"/>
+                <w:insideH w:val="none"/>
+                <w:insideV w:val="none"/>
+              </w:tblBorders>
+            </w:tblPr>
+            <w:tblGrid>
+              <w:gridCol w:w="5270"/>
+            </w:tblGrid>
+            <w:tr>
+              <w:tc>
+                <w:tcPr>
+                  <w:tcW w:type="dxa" w:w="5270"/>
+                  <w:shd w:val="clear" w:color="auto" w:fill="eaf0fb"/>
+                  <w:tcBorders>
+                    <w:top w:val="none"/>
+                    <w:left w:val="none"/>
+                    <w:bottom w:val="none"/>
+                    <w:right w:val="none"/>
+                    <w:insideH w:val="none"/>
+                    <w:insideV w:val="none"/>
+                  </w:tcBorders>
+                  <w:tcMar>
+                    <w:top w:w="35" w:type="dxa"/>
+                    <w:bottom w:w="35" w:type="dxa"/>
+                    <w:left w:w="80" w:type="dxa"/>
+                    <w:right w:w="80" w:type="dxa"/>
+                  </w:tcMar>
+                </w:tcPr>
+                <w:p>
+                  <w:pPr>
+                    <w:spacing w:before="0" w:after="0"/>
+                  </w:pPr>
+                  <w:r>
+                    <w:rPr>
+                      <w:b/>
+                      <w:color w:val="1F3864"/>
+                      <w:sz w:val="16"/>
+                    </w:rPr>
+                    <w:t xml:space="preserve">🌐  Live App  </w:t>
+                  </w:r>
+                  <w:r>
+                    <w:rPr>
+                      <w:color w:val="2471A3"/>
+                      <w:sz w:val="15"/>
+                      <w:u w:val="single"/>
+                    </w:rPr>
+                    <w:t>thesis-gru-evaluation-in-weather-forecasting.streamlit.app</w:t>
+                  </w:r>
+                </w:p>
+              </w:tc>
+            </w:tr>
+            <w:tr>
+              <w:tc>
+                <w:tcPr>
+                  <w:tcW w:type="dxa" w:w="5270"/>
+                  <w:shd w:val="clear" w:color="auto" w:fill="f4f6f7"/>
+                  <w:tcBorders>
+                    <w:top w:val="none"/>
+                    <w:left w:val="none"/>
+                    <w:bottom w:val="none"/>
+                    <w:right w:val="none"/>
+                    <w:insideH w:val="none"/>
+                    <w:insideV w:val="none"/>
+                  </w:tcBorders>
+                  <w:tcMar>
+                    <w:top w:w="35" w:type="dxa"/>
+                    <w:bottom w:w="35" w:type="dxa"/>
+                    <w:left w:w="80" w:type="dxa"/>
+                    <w:right w:w="80" w:type="dxa"/>
+                  </w:tcMar>
+                </w:tcPr>
+                <w:p>
+                  <w:pPr>
+                    <w:spacing w:before="0" w:after="0"/>
+                  </w:pPr>
+                  <w:r>
+                    <w:rPr>
+                      <w:b/>
+                      <w:color w:val="2C3E50"/>
+                      <w:sz w:val="16"/>
+                    </w:rPr>
+                    <w:t xml:space="preserve">💻  Source Code  </w:t>
+                  </w:r>
+                  <w:r>
+                    <w:rPr>
+                      <w:color w:val="2471A3"/>
+                      <w:sz w:val="15"/>
+                      <w:u w:val="single"/>
+                    </w:rPr>
+                    <w:t>github.com/EzekelCastro/Thesis-GRU-Evaluation-in-Weather-Forecasting</w:t>
+                  </w:r>
+                </w:p>
+              </w:tc>
+            </w:tr>
+          </w:tbl>
+          <w:p/>
+        </w:tc>
+      </w:tr>
+    </w:tbl>
+    <w:p>
+      <w:pPr>
+        <w:spacing w:before="0" w:after="0"/>
+        <w:rPr>
+          <w:sz w:val="2"/>
+          <w:szCs w:val="2"/>
+        </w:rPr>
+      </w:pPr>
+    </w:p>
+    <w:tbl>
+      <w:tblPr>
+        <w:tblW w:type="auto" w:w="0"/>
+        <w:tblLook w:firstColumn="1" w:firstRow="1" w:lastColumn="0" w:lastRow="0" w:noHBand="0" w:noVBand="1" w:val="04A0"/>
+        <w:tblBorders>
+          <w:top w:val="none"/>
+          <w:left w:val="none"/>
+          <w:bottom w:val="none"/>
+          <w:right w:val="none"/>
+          <w:insideH w:val="none"/>
+          <w:insideV w:val="none"/>
+        </w:tblBorders>
+      </w:tblPr>
+      <w:tblGrid>
+        <w:gridCol w:w="10540"/>
+      </w:tblGrid>
+      <w:tr>
+        <w:tc>
+          <w:tcPr>
+            <w:tcW w:type="dxa" w:w="10540"/>
+            <w:shd w:val="clear" w:color="auto" w:fill="2c3e50"/>
+            <w:tcBorders>
+              <w:top w:val="none"/>
+              <w:left w:val="none"/>
+              <w:bottom w:val="none"/>
+              <w:right w:val="none"/>
+              <w:insideH w:val="none"/>
+              <w:insideV w:val="none"/>
+            </w:tcBorders>
+            <w:tcMar>
+              <w:top w:w="55" w:type="dxa"/>
+              <w:bottom w:w="55" w:type="dxa"/>
+              <w:left w:w="200" w:type="dxa"/>
+              <w:right w:w="200" w:type="dxa"/>
+            </w:tcMar>
+          </w:tcPr>
           <w:p>
             <w:pPr>
-              <w:spacing w:after="40"/>
+              <w:spacing w:before="0" w:after="0"/>
+              <w:jc w:val="center"/>
             </w:pPr>
             <w:r>
               <w:rPr>
-                <w:sz w:val="19"/>
+                <w:color w:val="ADB5BD"/>
+                <w:sz w:val="15"/>
               </w:rPr>
-              <w:t xml:space="preserve">🔗 </w:t>
-            </w:r>
-            <w:r>
-              <w:rPr>
-                <w:color w:val="1F77B4"/>
-                <w:sz w:val="17"/>
-                <w:u w:val="single"/>
-              </w:rPr>
-              <w:t>thesis-gru-evaluation-in-weather-forecasting.streamlit.app</w:t>
-            </w:r>
-          </w:p>
-          <w:p>
-            <w:pPr>
-              <w:spacing w:before="160" w:after="40"/>
-            </w:pPr>
-            <w:r>
-              <w:rPr>
-                <w:b/>
-                <w:color w:val="1F3864"/>
-                <w:sz w:val="20"/>
-              </w:rPr>
-              <w:t>Source Code</w:t>
-            </w:r>
-          </w:p>
-          <w:p>
-            <w:pPr>
-              <w:spacing w:after="40"/>
-            </w:pPr>
-            <w:r>
-              <w:rPr>
-                <w:sz w:val="19"/>
-              </w:rPr>
-              <w:t xml:space="preserve">🔗 </w:t>
-            </w:r>
-            <w:r>
-              <w:rPr>
-                <w:color w:val="1F77B4"/>
-                <w:sz w:val="17"/>
-                <w:u w:val="single"/>
-              </w:rPr>
-              <w:t>github.com/EzekelCastro/Thesis-GRU-Evaluation-in-Weather-Forecasting</w:t>
+              <w:t>University of the Cordilleras  ·  Baguio City, Benguet, Philippines  ·  2026</w:t>
             </w:r>
           </w:p>
         </w:tc>
       </w:tr>
     </w:tbl>
-    <w:p>
-      <w:pPr>
-        <w:spacing w:before="40" w:after="40"/>
-        <w:pBdr>
-          <w:bottom w:val="single" w:sz="6" w:space="1" w:color="2c3e50"/>
-        </w:pBdr>
-      </w:pPr>
-    </w:p>
-    <w:p>
-      <w:pPr>
-        <w:spacing w:before="80"/>
-        <w:jc w:val="center"/>
-      </w:pPr>
-      <w:r>
-        <w:rPr>
-          <w:color w:val="9CA3AF"/>
-          <w:sz w:val="16"/>
-        </w:rPr>
-        <w:t>University of the Cordilleras  ·  Baguio City, Benguet, Philippines  ·  2026</w:t>
-      </w:r>
-    </w:p>
     <w:sectPr>
       <w:pgSz w:w="12240" w:h="15840"/>
-      <w:pgMar w:top="1020" w:right="1247" w:bottom="1020" w:left="1247" w:header="720" w:footer="720" w:gutter="0"/>
+      <w:pgMar w:top="624" w:right="850" w:bottom="624" w:left="850" w:header="720" w:footer="720" w:gutter="0"/>
       <w:cols w:space="720"/>
       <w:docGrid w:linePitch="360"/>
     </w:sectPr>

</xml_diff>